<commit_message>
Refine Wind Hydro and Water Wheel week
Co-authored-by: Cursor <cursoragent@cursor.com>
</commit_message>
<xml_diff>
--- a/production/labs/unit-02/water-wheel-flagship-lab-teacher.docx
+++ b/production/labs/unit-02/water-wheel-flagship-lab-teacher.docx
@@ -91,7 +91,7 @@
           <w:color w:val="2F3C7E"/>
           <w:sz w:val="26"/>
         </w:rPr>
-        <w:t>Thursday: hands-on testing. Friday: analysis, redesign, reflection.</w:t>
+        <w:t>Wednesday: build wheel + predict. Thursday: hands-on testing. Friday: analysis, redesign, reflection.</w:t>
       </w:r>
     </w:p>
     <w:p>
@@ -812,7 +812,7 @@
                 <w:color w:val="2F3C7E"/>
                 <w:sz w:val="26"/>
               </w:rPr>
-              <w:t>Build wheel + review fair test</w:t>
+              <w:t>Launch / safety / station assignment</w:t>
             </w:r>
           </w:p>
         </w:tc>
@@ -840,7 +840,7 @@
                 <w:color w:val="555555"/>
                 <w:sz w:val="24"/>
               </w:rPr>
-              <w:t>10</w:t>
+              <w:t>4</w:t>
             </w:r>
           </w:p>
         </w:tc>
@@ -896,7 +896,7 @@
                 <w:color w:val="555555"/>
                 <w:sz w:val="24"/>
               </w:rPr>
-              <w:t>15</w:t>
+              <w:t>16</w:t>
             </w:r>
           </w:p>
         </w:tc>
@@ -924,7 +924,7 @@
                 <w:color w:val="2F3C7E"/>
                 <w:sz w:val="26"/>
               </w:rPr>
-              <w:t>Record + quick cleanup</w:t>
+              <w:t>Cleanup + data check / exit</w:t>
             </w:r>
           </w:p>
         </w:tc>
@@ -952,7 +952,7 @@
                 <w:color w:val="555555"/>
                 <w:sz w:val="24"/>
               </w:rPr>
-              <w:t>5</w:t>
+              <w:t>10</w:t>
             </w:r>
           </w:p>
         </w:tc>

</xml_diff>